<commit_message>
Correct resume claims and describe AI-assisted workflow
Remove overstated claims (5+ apps in production, all projects deployed, Sift on FastAPI); GetGrip is described as formerly deployed. Add how AI agents are used (Claude Code with review and tests) and the testing stack.
</commit_message>
<xml_diff>
--- a/public/Akimov_Vladislav_Resume.docx
+++ b/public/Akimov_Vladislav_Resume.docx
@@ -247,7 +247,7 @@
           <w:sz w:val="21"/>
           <w:szCs w:val="21"/>
         </w:rPr>
-        <w:t xml:space="preserve">Full-stack разработчик с опытом создания продуктов около 2 лет: самостоятельно спроектировал, разработал и задеплоил 5+ full-stack приложений на стеке Next.js/TypeScript и FastAPI/NestJS. Среди них — SaaS-инструмент с биллингом Stripe и собственным OAuth2-сервером, а также AI-ассистент с интеграцией Claude API. Есть опыт коммерческой разработки под заказчика. Уверенно закрываю полный цикл: от интерфейса и бэкенда до настройки, деплоя и security hardening на собственных Linux-серверах.</w:t>
+        <w:t xml:space="preserve">Full-stack разработчик с опытом создания продуктов около 2 лет: спроектировал и разработал 5 собственных full-stack продуктов на Next.js/TypeScript и FastAPI/NestJS, а также интернет-магазин для заказчика. Среди них — SaaS-органайзер с биллингом Stripe и собственным OAuth2-сервером и AI-скринер вакансий на Claude API. Пишу код сам, а рутинные задачи делегирую AI-агентам (Claude Code) с обязательным ревью и тестами. Закрываю полный цикл: от интерфейса и бэкенда до деплоя и security hardening на Linux-сервере.</w:t>
       </w:r>
     </w:p>
     <w:p>
@@ -350,7 +350,7 @@
           <w:sz w:val="21"/>
           <w:szCs w:val="21"/>
         </w:rPr>
-        <w:t xml:space="preserve">JWT / OAuth2, Stripe-биллинг, security hardening (ufw, fail2ban, TLS), Git, WebSocket</w:t>
+        <w:t xml:space="preserve">JWT / OAuth2, Stripe-биллинг, security hardening (ufw, fail2ban, TLS), Git, WebSocket, тесты (Vitest, pytest, Playwright), Claude Code</w:t>
       </w:r>
     </w:p>
     <w:p>
@@ -529,7 +529,7 @@
           <w:sz w:val="21"/>
           <w:szCs w:val="21"/>
         </w:rPr>
-        <w:t xml:space="preserve">Спроектировал, разработал и запустил 5+ full-stack приложений в production, самостоятельно ведя каждый продукт от идеи до деплоя и поддержки.</w:t>
+        <w:t xml:space="preserve">Спроектировал и разработал 5 собственных full-stack продуктов, самостоятельно ведя каждый от идеи и архитектуры до тестов и деплоя.</w:t>
       </w:r>
     </w:p>
     <w:p>
@@ -555,7 +555,7 @@
           <w:sz w:val="21"/>
           <w:szCs w:val="21"/>
         </w:rPr>
-        <w:t xml:space="preserve"> — персональный SaaS-органайзер (задачи, привычки, цели, календарь). Веб + мобильный клиент, FastAPI-бэкенд, собственный OAuth2-сервер, Stripe-биллинг, WebSocket. Задеплоен на своём VPS.</w:t>
+        <w:t xml:space="preserve"> — персональный SaaS-органайзер (задачи, привычки, цели, календарь). Веб + мобильный клиент, FastAPI-бэкенд, собственный OAuth2-сервер, Stripe-биллинг, WebSocket. Работал в проде на собственном VPS (сейчас сервер выключен).</w:t>
       </w:r>
     </w:p>
     <w:p>
@@ -581,7 +581,7 @@
           <w:sz w:val="21"/>
           <w:szCs w:val="21"/>
         </w:rPr>
-        <w:t xml:space="preserve"> — AI-инструмент для скрининга откликов hh.ru: интеграция Claude API для оценки соответствия резюме и CRM-пайплайн управления откликами на FastAPI.</w:t>
+        <w:t xml:space="preserve"> — AI-скринер вакансий hh.ru на Next.js: оценка соответствия резюме через Claude API (structured output), сопроводительные письма и CRM-пайплайн откликов; данные hh.ru — через парсинг HTML.</w:t>
       </w:r>
     </w:p>
     <w:p>
@@ -625,7 +625,7 @@
           <w:sz w:val="21"/>
           <w:szCs w:val="21"/>
         </w:rPr>
-        <w:t xml:space="preserve">Настроил и администрировал инфраструктуру для всех проектов на собственных Linux-серверах: Docker, Nginx, systemd, security hardening (ufw, fail2ban, TLS).</w:t>
+        <w:t xml:space="preserve">Развернул и администрировал GetGrip и Muiraje на собственных VPS: Docker, Nginx, systemd, security hardening (ufw, fail2ban, TLS).</w:t>
       </w:r>
     </w:p>
     <w:p>

</xml_diff>